<commit_message>
Align Discussion age figures with the reported cohort data
The Discussion described the cohort as "aged 5 to 16 years", which is the
eligibility criterion stated in Methods, not an observed range; Results
report only a median age of 12 years with an interquartile range of 9 to
15. Restated both mentions in terms of what the data support, and noted
that the lower age boundary of the approach is untested in eight patients.

Co-Authored-By: Claude Opus 5 <noreply@anthropic.com>
</commit_message>
<xml_diff>
--- a/B.A.Main document revised highligted2 - DISCUSSION-rewritten.docx
+++ b/B.A.Main document revised highligted2 - DISCUSSION-rewritten.docx
@@ -4049,7 +4049,7 @@
           <w:szCs w:val="20"/>
           <w:lang w:val="en-US"/>
         </w:rPr>
-        <w:t xml:space="preserve">With five TIVA and three TCI patients, this series cannot compare the two techniques, and no comparison was attempted. Total hospital stay was numerically longer in the TCI group (8.0 versus 6.0 days); with three patients in that arm the ordering carries no inferential weight and should not be read as a disadvantage of the technique. The pediatric literature addresses exactly this comparison without settling it for cardiac surgery: target-controlled and manual propofol delivery have been compared directly in children [8], as has bispectral index behaviour under the two modes [9], and intravenous maintenance has a long descriptive record in pediatric cardiac anesthesia [10]. The adult signal is stronger. Bai et al. matched elderly cardiac surgical patients receiving target-controlled against manually controlled infusion across two international cohorts and found shorter intensive care stay, lower odds of reintubation, reduced blood pressure variability and a smaller burden of hypotension with TCI [16]. Two features separate that work from ours: their infusions ran on the Marsh and Minto models in elderly patients undergoing conventional surgery, whereas ours used the Eleveld model for propofol in children undergoing MICS. A further caveat belongs to our own method rather than to theirs. The remifentanil component was targeted with a model derived in adults, so its predicted effect-site concentrations in a 9 to 15 year old are best read as an operational setpoint rather than a measured exposure. In both arms the infusion was titrated against the density spectral array of the processed EEG, so what separated them was the interface used to reach a target, not whether depth of anesthesia was monitored.</w:t>
+        <w:t xml:space="preserve">With five TIVA and three TCI patients, this series cannot compare the two techniques, and no comparison was attempted. Total hospital stay was numerically longer in the TCI group (8.0 versus 6.0 days); with three patients in that arm the ordering carries no inferential weight and should not be read as a disadvantage of the technique. The pediatric literature addresses exactly this comparison without settling it for cardiac surgery: target-controlled and manual propofol delivery have been compared directly in children [8], as has bispectral index behaviour under the two modes [9], and intravenous maintenance has a long descriptive record in pediatric cardiac anesthesia [10]. The adult signal is stronger. Bai et al. matched elderly cardiac surgical patients receiving target-controlled against manually controlled infusion across two international cohorts and found shorter intensive care stay, lower odds of reintubation, reduced blood pressure variability and a smaller burden of hypotension with TCI [16]. Two features separate that work from ours: their infusions ran on the Marsh and Minto models in elderly patients undergoing conventional surgery, whereas ours used the Eleveld model for propofol in children undergoing MICS. A further caveat belongs to our own method rather than to theirs. The remifentanil component was targeted with a model derived in adults, so its predicted effect-site concentrations in children of this age are best read as an operational setpoint rather than a measured exposure. In both arms the infusion was titrated against the density spectral array of the processed EEG, so what separated them was the interface used to reach a target, not whether depth of anesthesia was monitored.</w:t>
       </w:r>
     </w:p>
     <w:p>
@@ -4073,7 +4073,7 @@
           <w:szCs w:val="20"/>
           <w:lang w:val="en-US"/>
         </w:rPr>
-        <w:t xml:space="preserve">Anesthesia for MICS is thoracic anesthesia added to cardiac anesthesia, and most of the addition falls on the airway [17]. Surgical access through a right anterior mini-thoracotomy requires lung isolation [18, 19], achieved either with a double-lumen tube whose position is confirmed bronchoscopically or with a bronchial blocker [19], and a left-sided double-lumen tube is the conventional choice [17]. External defibrillator pads are positioned before draping because internal cardioversion is often not possible during these procedures [19]; this was our routine in every case. The transfer of these techniques to a child is constrained less by principle than by device dimensions, and our cohort, aged 5 to 16 years with a median of 12, occupied the upper part of the pediatric range where adult-sized equipment becomes practicable. Ganapathy set out the anesthetic requirements of these operations more than two decades ago [20]; what has been added since is the combination of one-lung ventilation with carbon dioxide insufflation and the hemodynamic consequences that follow from it [18].</w:t>
+        <w:t xml:space="preserve">Anesthesia for MICS is thoracic anesthesia added to cardiac anesthesia, and most of the addition falls on the airway [17]. Surgical access through a right anterior mini-thoracotomy requires lung isolation [18, 19], achieved either with a double-lumen tube whose position is confirmed bronchoscopically or with a bronchial blocker [19], and a left-sided double-lumen tube is the conventional choice [17]. External defibrillator pads are positioned before draping because internal cardioversion is often not possible during these procedures [19]; this was our routine in every case. The transfer of these techniques to a child is constrained less by principle than by device dimensions, and our cohort, with a median age of 12 years and an interquartile range of 9 to 15, sat in the upper part of the pediatric range where adult-sized equipment becomes practicable. The protocol admitted children from 5 years of age, and how far down that scale it transfers is not a question eight patients can settle. Ganapathy set out the anesthetic requirements of these operations more than two decades ago [20]; what has been added since is the combination of one-lung ventilation with carbon dioxide insufflation and the hemodynamic consequences that follow from it [18].</w:t>
       </w:r>
     </w:p>
     <w:p>

</xml_diff>

<commit_message>
Humanize the Discussion prose
Applied the Wikipedia "Signs of AI writing" pattern set to the section
rewritten in the previous commits. Numbers, citation markers and factual
claims are unchanged; the audit confirms identical citation and number
sets before and after.

- Removed the repeated "X rather than Y" frame (7 occurrences to 0)
- Cut manufactured one-sentence beats ("One caution travels with it",
  "The adult signal is stronger")
- Dropped the authority trope "which is precisely the observation worth
  making"
- Replaced ornate metaphor with plain clinical statement: "anesthetic
  scaffolding", "appears on the other side of the equation", "sit at the
  fast end", "falls on the airway"
- "The literature we have relied on here was written for adults" narrowed
  to "Almost all", which is also the more accurate claim given refs 8-10
- Co-author highlighted text left untouched throughout

Co-Authored-By: Claude Opus 5 <noreply@anthropic.com>
</commit_message>
<xml_diff>
--- a/B.A.Main document revised highligted2 - DISCUSSION-rewritten.docx
+++ b/B.A.Main document revised highligted2 - DISCUSSION-rewritten.docx
@@ -4001,7 +4001,7 @@
           <w:szCs w:val="20"/>
           <w:lang w:val="en-US"/>
         </w:rPr>
-        <w:t xml:space="preserve">Eight children underwent right anterior mini-thoracotomy for atrial septal defect or mitral regurgitation over a ten-year period, and none sustained a major complication, an early arrhythmia, or death within 30 days. Median time to extubation was 150 minutes and median intensive care stay 24 hours. A series of this size describes a practice rather than testing one. What it does establish is that the anesthetic scaffolding of adult minimally invasive cardiac surgery, meaning one-lung ventilation, peripheral femoral bypass, effect-site targeted intravenous anesthesia, processed EEG and cerebral oximetry, can be assembled around a child of median weight 46 kg without a recovery penalty that would argue for returning to sternotomy. Pediatric surgical series have established that the operation itself is feasible and durable [4-7]; the present report describes the anesthetic conduct those series leave largely implicit.</w:t>
+        <w:t xml:space="preserve">Eight children underwent right anterior mini-thoracotomy for atrial septal defect or mitral regurgitation over a ten-year period. None sustained a major complication or an early arrhythmia, and there were no deaths within 30 days. Median time to extubation was 150 minutes and median intensive care stay 24 hours. A series of eight patients cannot test a technique, but it can record what was done and what followed. Our experience indicates that the anesthetic requirements of adult minimally invasive cardiac surgery, which include one-lung ventilation, peripheral femoral bypass, effect-site targeted intravenous anesthesia, processed EEG and cerebral oximetry, can be met in a child of median weight 46 kg, and that recovery was not delayed to a degree that would favour sternotomy. Pediatric surgical series have already established that the operation is feasible and durable [4-7]; what those series report less often is how the anesthetic was conducted.</w:t>
       </w:r>
     </w:p>
     <w:p>
@@ -4025,7 +4025,7 @@
           <w:szCs w:val="20"/>
           <w:lang w:val="en-US"/>
         </w:rPr>
-        <w:t xml:space="preserve">Our recovery times sit at the fast end of what the adult MICS literature reports. White and colleagues describe patients extubated within a few hours with an intensive care stay of 24 to 48 hours [11], and the institutional protocol of Demir and Mavioğlu sets early extubation within four to six hours as the target in hemodynamically stable patients [12]. Wang et al., implementing an operating room extubation programme for minimally invasive valve surgery, reduced median intubation duration from 13 to 8 hours without increasing reintubation or delirium [13]. In the largest relevant cohort, Jiang et al. analysed 947 MICS patients and recorded a mean intensive care stay of 22.83 hours under ultra-fast-track anesthesia against 44 hours under conventional management, with less rescue analgesia and a lower incidence of delirium [14]. Our median of 150 minutes to extubation and 24 hours in intensive care is unremarkable against that adult ultra-fast-track standard, which is precisely the observation worth making: the standard held in children. One caution travels with it. The same group found that the oxygenation index falls immediately after ultra-fast-track extubation and recovers only by 12 hours, with more frequent recourse to high-flow nasal oxygen [15]. Early extubation in a child needs a respiratory support plan behind it, not only a timing target.</w:t>
+        <w:t xml:space="preserve">Our recovery times fall at the fast end of what the adult MICS literature reports. White and colleagues describe patients extubated within a few hours and an intensive care stay of 24 to 48 hours [11], and the institutional protocol of Demir and Mavioğlu sets early extubation within four to six hours as the target in hemodynamically stable patients [12]. Wang et al., who implemented an operating room extubation programme for minimally invasive valve surgery, reduced median intubation duration from 13 to 8 hours without increasing reintubation or delirium [13]. In the largest relevant cohort, Jiang et al. analysed 947 MICS patients and recorded a mean intensive care stay of 22.83 hours under ultra-fast-track anesthesia against 44 hours under conventional management, with less rescue analgesia and a lower incidence of delirium [14]. Our median of 150 minutes to extubation and 24 hours in intensive care is therefore ordinary by adult ultra-fast-track standards, and the useful observation is that these standards were also met in children. The same group found that the oxygenation index falls immediately after ultra-fast-track extubation and recovers only by 12 hours, with more frequent recourse to high-flow nasal oxygen [15], so early extubation in a child requires a plan for respiratory support as well as a target time.</w:t>
       </w:r>
     </w:p>
     <w:p>
@@ -4049,7 +4049,7 @@
           <w:szCs w:val="20"/>
           <w:lang w:val="en-US"/>
         </w:rPr>
-        <w:t xml:space="preserve">With five TIVA and three TCI patients, this series cannot compare the two techniques, and no comparison was attempted. Total hospital stay was numerically longer in the TCI group (8.0 versus 6.0 days); with three patients in that arm the ordering carries no inferential weight and should not be read as a disadvantage of the technique. The pediatric literature addresses exactly this comparison without settling it for cardiac surgery: target-controlled and manual propofol delivery have been compared directly in children [8], as has bispectral index behaviour under the two modes [9], and intravenous maintenance has a long descriptive record in pediatric cardiac anesthesia [10]. The adult signal is stronger. Bai et al. matched elderly cardiac surgical patients receiving target-controlled against manually controlled infusion across two international cohorts and found shorter intensive care stay, lower odds of reintubation, reduced blood pressure variability and a smaller burden of hypotension with TCI [16]. Two features separate that work from ours: their infusions ran on the Marsh and Minto models in elderly patients undergoing conventional surgery, whereas ours used the Eleveld model for propofol in children undergoing MICS. A further caveat belongs to our own method rather than to theirs. The remifentanil component was targeted with a model derived in adults, so its predicted effect-site concentrations in children of this age are best read as an operational setpoint rather than a measured exposure. In both arms the infusion was titrated against the density spectral array of the processed EEG, so what separated them was the interface used to reach a target, not whether depth of anesthesia was monitored.</w:t>
+        <w:t xml:space="preserve">With five TIVA and three TCI patients, this series cannot compare the two techniques, and no comparison was attempted. Total hospital stay was numerically longer in the TCI group (8.0 versus 6.0 days), but with three patients in that arm the ordering carries no inferential weight and should not be read as a disadvantage of the technique. The pediatric literature addresses this comparison without settling it for cardiac surgery: target-controlled and manual propofol delivery have been compared directly in children [8], as has bispectral index behaviour under the two modes [9], and intravenous maintenance has a long descriptive record in pediatric cardiac anesthesia [10]. Evidence from adults is more substantial. Bai et al. matched elderly cardiac surgical patients receiving target-controlled against manually controlled infusion across two international cohorts and found shorter intensive care stay, lower odds of reintubation, reduced blood pressure variability and a smaller burden of hypotension with TCI [16]. Their work differs from ours in two respects: their infusions ran on the Marsh and Minto models in elderly patients undergoing conventional surgery, whereas ours used the Eleveld model for propofol in children undergoing MICS. Our own method carries a further caveat. The remifentanil component was targeted with a model derived in adults, so its predicted effect-site concentrations in children of this age represent an operational setpoint, since actual exposure was not measured. In both arms the infusion was titrated against the density spectral array of the processed EEG, so the two groups differed in the interface used to reach a target while depth of anesthesia was monitored in the same way.</w:t>
       </w:r>
     </w:p>
     <w:p>
@@ -4073,7 +4073,7 @@
           <w:szCs w:val="20"/>
           <w:lang w:val="en-US"/>
         </w:rPr>
-        <w:t xml:space="preserve">Anesthesia for MICS is thoracic anesthesia added to cardiac anesthesia, and most of the addition falls on the airway [17]. Surgical access through a right anterior mini-thoracotomy requires lung isolation [18, 19], achieved either with a double-lumen tube whose position is confirmed bronchoscopically or with a bronchial blocker [19], and a left-sided double-lumen tube is the conventional choice [17]. External defibrillator pads are positioned before draping because internal cardioversion is often not possible during these procedures [19]; this was our routine in every case. The transfer of these techniques to a child is constrained less by principle than by device dimensions, and our cohort, with a median age of 12 years and an interquartile range of 9 to 15, sat in the upper part of the pediatric range where adult-sized equipment becomes practicable. The protocol admitted children from 5 years of age, and how far down that scale it transfers is not a question eight patients can settle. Ganapathy set out the anesthetic requirements of these operations more than two decades ago [20]; what has been added since is the combination of one-lung ventilation with carbon dioxide insufflation and the hemodynamic consequences that follow from it [18].</w:t>
+        <w:t xml:space="preserve">MICS anesthesia combines cardiac anesthesia with elements of thoracic practice, and most of what it adds concerns the airway [17]. Surgical access through a right anterior mini-thoracotomy requires lung isolation [18, 19], achieved either with a double-lumen tube whose position is confirmed bronchoscopically or with a bronchial blocker [19], and a left-sided double-lumen tube is the conventional choice [17]. External defibrillator pads are positioned before draping because internal cardioversion is often not possible during these procedures [19], and this was our routine in every case. Device dimensions, more than any anesthetic principle, limit how far these techniques transfer to a child. Our cohort, with a median age of 12 years and an interquartile range of 9 to 15, sat in the upper part of the pediatric range where adult-sized equipment becomes practicable. The protocol admitted children from 5 years of age, and eight patients cannot establish how far down that scale the approach transfers. Ganapathy set out the anesthetic requirements of these operations more than two decades ago [20]; the main addition since then has been the combination of one-lung ventilation with carbon dioxide insufflation and the hemodynamic consequences that follow [18].</w:t>
       </w:r>
     </w:p>
     <w:p>
@@ -4097,7 +4097,7 @@
           <w:szCs w:val="20"/>
           <w:lang w:val="en-US"/>
         </w:rPr>
-        <w:t xml:space="preserve">Peripheral cannulation creates a monitoring problem that full sternotomy does not. When femoral arterial return meets blood ejected by a heart that is still contracting, the upper body can be perfused with deoxygenated blood, and cerebral oximetry is often where this first becomes visible [12, 19]. Aquilina et al. documented the sequence during minimally invasive mitral repair, where right upper limb saturation fell to 65% after the venous cannula migrated out of the superior vena cava and returned to 100% once it was repositioned [21]. Demir and Mavioğlu give the operational thresholds, a regional saturation below 45 or a fall of more than 20% from baseline, and place cannula position among the first things to check when they are breached [12]. The Bonn protocol likewise treats near-infrared spectroscopy and processed EEG as components of the standard monitoring bundle rather than optional additions [22]. Both were used in all eight of our patients. In a child the cannulae are smaller and the circulating volume lower, so a given displacement should be expected to produce a larger fractional change in venous drainage, which strengthens rather than weakens the argument for continuous cerebral oximetry.</w:t>
+        <w:t xml:space="preserve">Peripheral cannulation creates a monitoring problem that full sternotomy does not. When femoral arterial return meets blood ejected by a heart that is still contracting, the upper body can be perfused with deoxygenated blood, and cerebral oximetry is often where this first becomes apparent [12, 19]. Aquilina et al. documented the sequence during minimally invasive mitral repair: right upper limb saturation fell to 65% after the venous cannula migrated out of the superior vena cava and returned to 100% once it was repositioned [21]. Demir and Mavioğlu give the operational thresholds, a regional saturation below 45 or a fall of more than 20% from baseline, and they place cannula position among the first things to check when these thresholds are breached [12]. The Bonn protocol also includes near-infrared spectroscopy and processed EEG in its standard monitoring bundle [22], and we used both in all eight patients. Cannulae are smaller and circulating volume lower in a child, so the same degree of displacement can be expected to produce a larger fractional change in venous drainage, which is an argument for continuous cerebral oximetry in this population.</w:t>
       </w:r>
     </w:p>
     <w:p>
@@ -4121,7 +4121,7 @@
           <w:szCs w:val="20"/>
           <w:lang w:val="en-US"/>
         </w:rPr>
-        <w:t xml:space="preserve">Analgesia is the part of our protocol with the clearest room for improvement. Maintenance analgesia was remifentanil in both arms, and remifentanil leaves nothing behind once it is stopped. Marianello et al. administered a single-shot deep serratus anterior plane block an hour before extubation in adults undergoing minimally invasive mitral surgery and reduced the proportion of patients requiring rescue opioids over the first 24 hours from 84% to 20%, with better sedation scores [23]. The same intervention appears on the other side of the equation in the ultra-fast-track data, where fascial plane blockade was an independent positive predictor of achieving ultra-fast-track management and intraoperative opioid dose a negative one [14]; higher intraoperative morphine equivalents likewise reduced the odds of operating room extubation in the series of Wang et al. [13]. A regional adjunct is the most clearly indicated next addition to a pediatric pathway of this kind.</w:t>
+        <w:t xml:space="preserve">Analgesia is the part of our protocol with the clearest room for improvement. Maintenance analgesia was remifentanil in both arms, and remifentanil provides no residual analgesia once the infusion stops. Marianello et al. administered a single-shot deep serratus anterior plane block an hour before extubation in adults undergoing minimally invasive mitral surgery and reduced the proportion of patients requiring rescue opioids over the first 24 hours from 84% to 20%, with better sedation scores [23]. Regional blockade also features in the ultra-fast-track data, where fascial plane blockade was an independent positive predictor of achieving ultra-fast-track management and intraoperative opioid dose a negative one [14]; higher intraoperative morphine equivalents likewise reduced the odds of operating room extubation in the series of Wang et al. [13]. A regional adjunct is therefore the addition most clearly indicated for a pediatric pathway of this kind.</w:t>
       </w:r>
     </w:p>
     <w:p>
@@ -4145,7 +4145,7 @@
           <w:szCs w:val="20"/>
           <w:lang w:val="en-US"/>
         </w:rPr>
-        <w:t xml:space="preserve">Eight patients over ten years is roughly one per year, and that rate describes the practice in a way the outcome table does not. These operations are offered to carefully selected children by a team that performs them regularly in adults, and the scientific statement on percutaneous and minimally invasive valve procedures identified the learning curve and cross-specialty team training as determinants of outcome well before the techniques became routine [24]. Case reports continue to show the boundary moving where experience is concentrated, including mitral valve replacement through a mini-thoracotomy in a patient with a giant left atrium [25], and the anesthetic skill set has been described as a distinct competency rather than an extension of routine cardiac practice [26]. The literature we have relied on here was written for adults. Until pediatric-specific data accumulate, careful extrapolation remains the only available route, and it should be labelled as such. A multicentre registry recording the endpoints used in this report, time to extubation, intensive care stay, vasoactive requirement and oxygenation after extubation, would turn a collection of single-centre experiences into evidence.</w:t>
+        <w:t xml:space="preserve">Eight patients over ten years is roughly one per year. That volume reflects careful case selection, and it also limits what a single centre can demonstrate. These operations are offered to selected children by a team that performs them regularly in adults, and the scientific statement on percutaneous and minimally invasive valve procedures identified the learning curve and cross-specialty team training as determinants of outcome well before these techniques became routine [24]. Case reports continue to show the boundary moving where experience is concentrated, among them a mitral valve replacement through a mini-thoracotomy in a patient with a giant left atrium [25], and the anesthetic skill set has been described as a distinct competency within cardiac practice [26]. Almost all of the literature we have relied on here was written for adults, and until pediatric-specific data accumulate, careful extrapolation remains the only available route and should be identified as such. A multicentre registry recording the endpoints used in this report, time to extubation, intensive care stay, vasoactive requirement and oxygenation after extubation, would allow single-centre experiences of this kind to be pooled.</w:t>
       </w:r>
     </w:p>
     <w:p>
@@ -4369,7 +4369,7 @@
           <w:szCs w:val="20"/>
           <w:lang w:val="en-US"/>
         </w:rPr>
-        <w:t xml:space="preserve">A further caveat concerns the pharmacokinetic models used for target-controlled delivery. Remifentanil was targeted with the Minto model, which was derived in adults, so the effect-site concentrations recorded in the TCI group should be read as an operational setpoint rather than a validated pediatric exposure. </w:t>
+        <w:t xml:space="preserve">The pharmacokinetic models used for target-controlled delivery are a further limitation. Remifentanil was targeted with the Minto model, which was derived in adults, so the effect-site concentrations recorded in the TCI group represent an operational setpoint that has not been validated in children. </w:t>
       </w:r>
       <w:r>
         <w:rPr>

</xml_diff>